<commit_message>
Professor-Uebersicht praezisiert: Block 1 mit Vorher/Nachher-Kontrast (keine eigene PD-Rechnung, Banken-Kohortenformel uebernommen)
Co-Authored-By: Claude Opus 4.8 <noreply@anthropic.com>
</commit_message>
<xml_diff>
--- a/Umsetzung_Professorenfeedback.docx
+++ b/Umsetzung_Professorenfeedback.docx
@@ -57,8 +57,8 @@
         <w:tblLook w:firstColumn="1" w:firstRow="1" w:lastColumn="0" w:lastRow="0" w:noHBand="0" w:noVBand="1" w:val="04A0"/>
       </w:tblPr>
       <w:tblGrid>
-        <w:gridCol w:w="2948"/>
-        <w:gridCol w:w="6463"/>
+        <w:gridCol w:w="4873"/>
+        <w:gridCol w:w="4873"/>
       </w:tblGrid>
       <w:tr>
         <w:tc>
@@ -114,7 +114,7 @@
               <w:rPr>
                 <w:sz w:val="18"/>
               </w:rPr>
-              <w:t>Erledigt — wir berechnen gar keine eigene PD mehr aus Volumina. Das Modell übernimmt die bank-internen A-IRB-PDs aus den Pillar-3-Berichten (EU-CR6): kohortenbasierte 1-Jahres-Ausfallwahrscheinlichkeiten auf Schuldner-Ebene, von der EZB auditiert (CRR Art. 180).</w:t>
+              <w:t>Erledigt — die eigene, volumenbasierte PD-Berechnung wurde ersatzlos gestrichen. Das Modell übernimmt die A-IRB-PDs der Banken aus Pillar 3 (EU CR6); diese sind regulatorisch vorgeschrieben stückzahlbasiert: Anzahl ausgefallener Schuldner ÷ Anzahl Schuldner der fixierten Jahres-Kohorte (CRR Art. 180).</w:t>
             </w:r>
           </w:p>
         </w:tc>
@@ -411,7 +411,65 @@
           <w:b w:val="0"/>
           <w:sz w:val="21"/>
         </w:rPr>
-        <w:t>Statt eine PD selbst aus „Defaulted / Original Exposure“ zu schätzen (Wert- statt Mengengrößen), konsumiert das Modell die regulatorische PD — die bank-internen A-IRB-Schätzungen aus den Pillar-3-Berichten. Diese sind exakt so konstruiert, wie im Gespräch gefordert: festes Schuldner-Kohortenportfolio zum Jahresbeginn, 12-Monats-Beobachtung, Ausfallzählung auf Schuldner-Ebene, langfristiger Durchschnitt der 1-Jahres-Ausfallraten.</w:t>
+        <w:t>Die kritisierte eigene PD-Berechnung aus Volumengrößen wurde vollständig aus dem Modell entfernt. Das Modell schätzt keine PD mehr selbst — es übernimmt die fertige, regulatorische PD aus den Pillar-3-Berichten der Banken (Template EU CR6) und verwendet sie unverändert.</w:t>
+      </w:r>
+    </w:p>
+    <w:p>
+      <w:pPr>
+        <w:spacing w:after="40"/>
+      </w:pPr>
+      <w:r>
+        <w:rPr>
+          <w:b/>
+          <w:color w:val="A52F4D"/>
+          <w:sz w:val="20"/>
+        </w:rPr>
+        <w:t xml:space="preserve">Vorher (kritisiert):   </w:t>
+      </w:r>
+      <w:r>
+        <w:rPr>
+          <w:b w:val="0"/>
+          <w:color w:val="A52F4D"/>
+          <w:sz w:val="20"/>
+        </w:rPr>
+        <w:t>PD ≈ Defaulted Exposure ÷ Original Exposure</w:t>
+      </w:r>
+      <w:r>
+        <w:rPr>
+          <w:b w:val="0"/>
+          <w:color w:val="6E6E6E"/>
+          <w:sz w:val="20"/>
+        </w:rPr>
+        <w:t xml:space="preserve">   — €-Beträge; aus einem ausgefallenen Betrag ist nicht ablesbar, wie viele Schuldner ausgefallen sind.</w:t>
+      </w:r>
+    </w:p>
+    <w:p>
+      <w:pPr>
+        <w:spacing w:after="120"/>
+      </w:pPr>
+      <w:r>
+        <w:rPr>
+          <w:b/>
+          <w:color w:val="007A77"/>
+          <w:sz w:val="20"/>
+        </w:rPr>
+        <w:t xml:space="preserve">Jetzt (übernommen):  </w:t>
+      </w:r>
+      <w:r>
+        <w:rPr>
+          <w:b w:val="0"/>
+          <w:color w:val="007A77"/>
+          <w:sz w:val="20"/>
+        </w:rPr>
+        <w:t>PD = Anzahl ausgefallener Schuldner ÷ Anzahl Schuldner der Kohorte vom 01.01.</w:t>
+      </w:r>
+      <w:r>
+        <w:rPr>
+          <w:b w:val="0"/>
+          <w:color w:val="6E6E6E"/>
+          <w:sz w:val="20"/>
+        </w:rPr>
+        <w:t xml:space="preserve">   — Stückzahlen; so berechnen die Banken ihre A-IRB-PDs nach CRR Art. 180, EZB-auditiert. Wir rechnen das nicht nach, wir übernehmen das Ergebnis.</w:t>
       </w:r>
     </w:p>
     <w:p>
@@ -430,7 +488,7 @@
           <w:b w:val="0"/>
           <w:sz w:val="21"/>
         </w:rPr>
-        <w:t>Die Corporate-PD der Deutschen Bank stammt direkt aus „Pillar 3 Report Q4 2024“, S. 108–113 (Template EU CR6) — 10/10 Banken sind so Pillar-3-verifiziert (65 von 70 Datenzellen bank-spezifisch, 93 %; die 5 Proxy-Zellen sind offen als solche markiert).</w:t>
+        <w:t>Die Corporate-PD der Deutschen Bank im Modell ist exakt der Wert aus „Pillar 3 Report Q4 2024“, S. 108–113 (EU CR6) — keine eigene Umrechnung. 10/10 Banken sind so Pillar-3-verifiziert (65 von 70 Datenzellen bank-spezifisch, 93 %; die 5 Proxy-Zellen sind offen als solche markiert).</w:t>
       </w:r>
     </w:p>
     <w:p>
@@ -442,14 +500,14 @@
           <w:b/>
           <w:sz w:val="21"/>
         </w:rPr>
-        <w:t xml:space="preserve">Ökonomische Interpretation: </w:t>
+        <w:t xml:space="preserve">Ökonomische Interpretation — saubere Arbeitsteilung der Größen: </w:t>
       </w:r>
       <w:r>
         <w:rPr>
           <w:b w:val="0"/>
           <w:sz w:val="21"/>
         </w:rPr>
-        <w:t>Wir messen Ausfall-Wahrscheinlichkeit als Mengengröße (Anzahl ausgefallener Schuldner), bewerten den Verlust aber mit der Wertgröße EAD (Restschuld bei Ausfall) — die Trennung, die im Feedback angemahnt wurde: EL = PD · LGD · EAD.</w:t>
+        <w:t>Die Wahrscheinlichkeitsfrage („Wie viele Schuldner fallen aus?“) wird in der übernommenen PD mit Stückzahlen beantwortet. Die Wertgrößen kommen erst danach ins Spiel, wo sie hingehören — bei der Verlusthöhe: EAD ist die Restschuld zum Ausfallzeitpunkt (nicht der ursprüngliche Kreditbetrag), LGD der Verlustanteil darauf. Mengen- und Wertgrößen bleiben getrennt und treffen sich erst in EL = PD · LGD · EAD.</w:t>
       </w:r>
     </w:p>
     <w:p>
@@ -774,7 +832,7 @@
           <w:b w:val="0"/>
           <w:sz w:val="21"/>
         </w:rPr>
-        <w:t>Alle 10 To-dos aus dem Gespräch sind umgesetzt. Die zwei methodischen Kernforderungen — saubere, mengenbasierte 1-Jahres-PD und getrennte, ökonomisch begründete Risikofaktoren — sind nicht nachträglich dokumentiert, sondern strukturell im Modell verankert: regulatorische A-IRB-PDs als Datenbasis, 2-Faktor-Sensitivitäten mit belegten β je Asset-Klasse.</w:t>
+        <w:t>Alle 10 To-dos aus dem Gespräch sind umgesetzt. Die zwei methodischen Kernforderungen — saubere, stückzahlbasierte 1-Jahres-PD und getrennte, ökonomisch begründete Risikofaktoren — sind nicht nachträglich dokumentiert, sondern strukturell im Modell verankert: regulatorische A-IRB-PDs als Datenbasis, 2-Faktor-Sensitivitäten mit belegten β je Asset-Klasse.</w:t>
       </w:r>
     </w:p>
     <w:sectPr>

</xml_diff>